<commit_message>
update lectures and labs 1-2
</commit_message>
<xml_diff>
--- a/labs/LAB 1/Lab 1 Demo Script.docx
+++ b/labs/LAB 1/Lab 1 Demo Script.docx
@@ -67,23 +67,7 @@
           <w:szCs w:val="32"/>
           <w:rtl w:val="0"/>
         </w:rPr>
-        <w:t xml:space="preserve">For each code block, explain what you want to do first, then write code, and finally </w:t>
-      </w:r>
-      <w:r>
-        <w:rPr>
-          <w:sz w:val="32"/>
-          <w:szCs w:val="32"/>
-          <w:rtl w:val="0"/>
-        </w:rPr>
-        <w:t xml:space="preserve">comment your</w:t>
-      </w:r>
-      <w:r>
-        <w:rPr>
-          <w:sz w:val="32"/>
-          <w:szCs w:val="32"/>
-          <w:rtl w:val="0"/>
-        </w:rPr>
-        <w:t xml:space="preserve"> code (so that others have time to catch up). </w:t>
+        <w:t xml:space="preserve">For each code block, explain what you want to do first, then write code, and finally comment your code (so that others have time to catch up). </w:t>
       </w:r>
     </w:p>
     <w:p>
@@ -329,7 +313,7 @@
         </w:rPr>
         <w:t xml:space="preserve">Open google colab using </w:t>
       </w:r>
-      <w:hyperlink r:id="rId6">
+      <w:hyperlink r:id="rId7">
         <w:r>
           <w:rPr>
             <w:rFonts w:ascii="Lato" w:cs="Lato" w:eastAsia="Lato" w:hAnsi="Lato"/>
@@ -350,60 +334,6 @@
           <w:rtl w:val="0"/>
         </w:rPr>
         <w:t xml:space="preserve"> but you don’t need to make a new notebook. Instead, you should copy the template notebook which you can find on the website (link </w:t>
-      </w:r>
-      <w:hyperlink r:id="rId7">
-        <w:r>
-          <w:rPr>
-            <w:rFonts w:ascii="Lato" w:cs="Lato" w:eastAsia="Lato" w:hAnsi="Lato"/>
-            <w:color w:val="1155cc"/>
-            <w:sz w:val="21"/>
-            <w:szCs w:val="21"/>
-            <w:u w:val="single"/>
-            <w:rtl w:val="0"/>
-          </w:rPr>
-          <w:t xml:space="preserve">here</w:t>
-        </w:r>
-      </w:hyperlink>
-      <w:r>
-        <w:rPr>
-          <w:rFonts w:ascii="Lato" w:cs="Lato" w:eastAsia="Lato" w:hAnsi="Lato"/>
-          <w:sz w:val="21"/>
-          <w:szCs w:val="21"/>
-          <w:rtl w:val="0"/>
-        </w:rPr>
-        <w:t xml:space="preserve">). </w:t>
-      </w:r>
-    </w:p>
-    <w:p>
-      <w:pPr>
-        <w:numPr>
-          <w:ilvl w:val="0"/>
-          <w:numId w:val="2"/>
-        </w:numPr>
-        <w:ind w:left="720" w:hanging="360"/>
-        <w:rPr>
-          <w:rFonts w:ascii="Lato" w:cs="Lato" w:eastAsia="Lato" w:hAnsi="Lato"/>
-          <w:sz w:val="21"/>
-          <w:szCs w:val="21"/>
-        </w:rPr>
-      </w:pPr>
-      <w:r>
-        <w:rPr>
-          <w:rFonts w:ascii="Lato" w:cs="Lato" w:eastAsia="Lato" w:hAnsi="Lato"/>
-          <w:sz w:val="21"/>
-          <w:szCs w:val="21"/>
-          <w:rtl w:val="0"/>
-        </w:rPr>
-        <w:t xml:space="preserve">Then,  we need to go get the data from the website too</w:t>
-      </w:r>
-      <w:r>
-        <w:rPr>
-          <w:rFonts w:ascii="Lato" w:cs="Lato" w:eastAsia="Lato" w:hAnsi="Lato"/>
-          <w:sz w:val="21"/>
-          <w:szCs w:val="21"/>
-          <w:rtl w:val="0"/>
-        </w:rPr>
-        <w:t xml:space="preserve">. Link </w:t>
       </w:r>
       <w:hyperlink r:id="rId8">
         <w:r>
@@ -425,6 +355,51 @@
           <w:szCs w:val="21"/>
           <w:rtl w:val="0"/>
         </w:rPr>
+        <w:t xml:space="preserve">). </w:t>
+      </w:r>
+    </w:p>
+    <w:p>
+      <w:pPr>
+        <w:numPr>
+          <w:ilvl w:val="0"/>
+          <w:numId w:val="2"/>
+        </w:numPr>
+        <w:ind w:left="720" w:hanging="360"/>
+        <w:rPr>
+          <w:rFonts w:ascii="Lato" w:cs="Lato" w:eastAsia="Lato" w:hAnsi="Lato"/>
+          <w:sz w:val="21"/>
+          <w:szCs w:val="21"/>
+        </w:rPr>
+      </w:pPr>
+      <w:r>
+        <w:rPr>
+          <w:rFonts w:ascii="Lato" w:cs="Lato" w:eastAsia="Lato" w:hAnsi="Lato"/>
+          <w:sz w:val="21"/>
+          <w:szCs w:val="21"/>
+          <w:rtl w:val="0"/>
+        </w:rPr>
+        <w:t xml:space="preserve">Then,  we need to go get the data from the website too. Link </w:t>
+      </w:r>
+      <w:hyperlink r:id="rId9">
+        <w:r>
+          <w:rPr>
+            <w:rFonts w:ascii="Lato" w:cs="Lato" w:eastAsia="Lato" w:hAnsi="Lato"/>
+            <w:color w:val="1155cc"/>
+            <w:sz w:val="21"/>
+            <w:szCs w:val="21"/>
+            <w:u w:val="single"/>
+            <w:rtl w:val="0"/>
+          </w:rPr>
+          <w:t xml:space="preserve">here</w:t>
+        </w:r>
+      </w:hyperlink>
+      <w:r>
+        <w:rPr>
+          <w:rFonts w:ascii="Lato" w:cs="Lato" w:eastAsia="Lato" w:hAnsi="Lato"/>
+          <w:sz w:val="21"/>
+          <w:szCs w:val="21"/>
+          <w:rtl w:val="0"/>
+        </w:rPr>
         <w:t xml:space="preserve"> (unzip the file download). </w:t>
       </w:r>
     </w:p>
@@ -448,16 +423,7 @@
           <w:szCs w:val="21"/>
           <w:rtl w:val="0"/>
         </w:rPr>
-        <w:t xml:space="preserve">Use the  </w:t>
-      </w:r>
-      <w:r>
-        <w:rPr>
-          <w:rFonts w:ascii="Lato" w:cs="Lato" w:eastAsia="Lato" w:hAnsi="Lato"/>
-          <w:sz w:val="21"/>
-          <w:szCs w:val="21"/>
-          <w:rtl w:val="0"/>
-        </w:rPr>
-        <w:t xml:space="preserve">iris.data file.</w:t>
+        <w:t xml:space="preserve">Use the  iris.data file.</w:t>
       </w:r>
     </w:p>
     <w:p>
@@ -503,11 +469,6 @@
         </w:rPr>
         <w:t xml:space="preserve">Talk about the variables tab. </w:t>
       </w:r>
-      <w:r>
-        <w:rPr>
-          <w:rtl w:val="0"/>
-        </w:rPr>
-      </w:r>
     </w:p>
     <w:p>
       <w:pPr>
@@ -522,7 +483,6 @@
           <w:rFonts w:ascii="Lato" w:cs="Lato" w:eastAsia="Lato" w:hAnsi="Lato"/>
           <w:sz w:val="21"/>
           <w:szCs w:val="21"/>
-          <w:u w:val="none"/>
         </w:rPr>
       </w:pPr>
       <w:r>
@@ -533,6 +493,11 @@
           <w:rtl w:val="0"/>
         </w:rPr>
         <w:t xml:space="preserve">Let’s take a look at the template code in the notebook. This code will be explained in Lecture 2 but for now trust me on the implementation. Let’s print out the sepal_lengths list to see what we have to work with. </w:t>
+      </w:r>
+      <w:r>
+        <w:rPr>
+          <w:rtl w:val="0"/>
+        </w:rPr>
       </w:r>
     </w:p>
     <w:p>
@@ -584,7 +549,6 @@
           <w:rFonts w:ascii="Lato" w:cs="Lato" w:eastAsia="Lato" w:hAnsi="Lato"/>
           <w:sz w:val="21"/>
           <w:szCs w:val="21"/>
-          <w:u w:val="none"/>
         </w:rPr>
       </w:pPr>
       <w:r>
@@ -662,16 +626,16 @@
           <wp:inline distB="114300" distT="114300" distL="114300" distR="114300">
             <wp:extent cx="5943600" cy="127000"/>
             <wp:effectExtent b="0" l="0" r="0" t="0"/>
-            <wp:docPr id="5" name="image3.png"/>
+            <wp:docPr id="1" name="image2.png"/>
             <a:graphic>
               <a:graphicData uri="http://schemas.openxmlformats.org/drawingml/2006/picture">
                 <pic:pic>
                   <pic:nvPicPr>
-                    <pic:cNvPr id="0" name="image3.png"/>
+                    <pic:cNvPr id="0" name="image2.png"/>
                     <pic:cNvPicPr preferRelativeResize="0"/>
                   </pic:nvPicPr>
                   <pic:blipFill>
-                    <a:blip r:embed="rId9"/>
+                    <a:blip r:embed="rId10"/>
                     <a:srcRect b="0" l="0" r="0" t="0"/>
                     <a:stretch>
                       <a:fillRect/>
@@ -710,7 +674,6 @@
           <w:rFonts w:ascii="Lato" w:cs="Lato" w:eastAsia="Lato" w:hAnsi="Lato"/>
           <w:sz w:val="21"/>
           <w:szCs w:val="21"/>
-          <w:u w:val="none"/>
         </w:rPr>
       </w:pPr>
       <w:r>
@@ -721,6 +684,11 @@
           <w:rtl w:val="0"/>
         </w:rPr>
         <w:t xml:space="preserve">Now that we’ve isolated all the sepal lengths, we can find the mean, median, min, and max of the sepal lengths. I’m going to introduce the sum and len functions here. The sum function takes in a list as input and gives you the sum of all the values in the list. The len function also takes in a list as input but gives you the length of the list. </w:t>
+      </w:r>
+      <w:r>
+        <w:rPr>
+          <w:rtl w:val="0"/>
+        </w:rPr>
       </w:r>
     </w:p>
     <w:p>
@@ -879,16 +847,16 @@
           <wp:inline distB="114300" distT="114300" distL="114300" distR="114300">
             <wp:extent cx="2909888" cy="390215"/>
             <wp:effectExtent b="0" l="0" r="0" t="0"/>
-            <wp:docPr id="1" name="image5.png"/>
+            <wp:docPr id="3" name="image4.png"/>
             <a:graphic>
               <a:graphicData uri="http://schemas.openxmlformats.org/drawingml/2006/picture">
                 <pic:pic>
                   <pic:nvPicPr>
-                    <pic:cNvPr id="0" name="image5.png"/>
+                    <pic:cNvPr id="0" name="image4.png"/>
                     <pic:cNvPicPr preferRelativeResize="0"/>
                   </pic:nvPicPr>
                   <pic:blipFill>
-                    <a:blip r:embed="rId10"/>
+                    <a:blip r:embed="rId11"/>
                     <a:srcRect b="0" l="0" r="0" t="0"/>
                     <a:stretch>
                       <a:fillRect/>
@@ -927,7 +895,6 @@
           <w:rFonts w:ascii="Lato" w:cs="Lato" w:eastAsia="Lato" w:hAnsi="Lato"/>
           <w:sz w:val="21"/>
           <w:szCs w:val="21"/>
-          <w:u w:val="none"/>
         </w:rPr>
       </w:pPr>
       <w:r>
@@ -997,16 +964,16 @@
           <wp:inline distB="114300" distT="114300" distL="114300" distR="114300">
             <wp:extent cx="514350" cy="313894"/>
             <wp:effectExtent b="0" l="0" r="0" t="0"/>
-            <wp:docPr id="2" name="image1.png"/>
+            <wp:docPr id="2" name="image3.png"/>
             <a:graphic>
               <a:graphicData uri="http://schemas.openxmlformats.org/drawingml/2006/picture">
                 <pic:pic>
                   <pic:nvPicPr>
-                    <pic:cNvPr id="0" name="image1.png"/>
+                    <pic:cNvPr id="0" name="image3.png"/>
                     <pic:cNvPicPr preferRelativeResize="0"/>
                   </pic:nvPicPr>
                   <pic:blipFill>
-                    <a:blip r:embed="rId11"/>
+                    <a:blip r:embed="rId12"/>
                     <a:srcRect b="0" l="0" r="83333" t="45075"/>
                     <a:stretch>
                       <a:fillRect/>
@@ -1199,16 +1166,16 @@
           <wp:inline distB="114300" distT="114300" distL="114300" distR="114300">
             <wp:extent cx="2143125" cy="285750"/>
             <wp:effectExtent b="0" l="0" r="0" t="0"/>
-            <wp:docPr id="4" name="image4.png"/>
+            <wp:docPr id="5" name="image1.png"/>
             <a:graphic>
               <a:graphicData uri="http://schemas.openxmlformats.org/drawingml/2006/picture">
                 <pic:pic>
                   <pic:nvPicPr>
-                    <pic:cNvPr id="0" name="image4.png"/>
+                    <pic:cNvPr id="0" name="image1.png"/>
                     <pic:cNvPicPr preferRelativeResize="0"/>
                   </pic:nvPicPr>
                   <pic:blipFill>
-                    <a:blip r:embed="rId12"/>
+                    <a:blip r:embed="rId13"/>
                     <a:srcRect b="0" l="0" r="37500" t="50000"/>
                     <a:stretch>
                       <a:fillRect/>
@@ -1247,7 +1214,6 @@
           <w:rFonts w:ascii="Lato" w:cs="Lato" w:eastAsia="Lato" w:hAnsi="Lato"/>
           <w:sz w:val="21"/>
           <w:szCs w:val="21"/>
-          <w:u w:val="none"/>
         </w:rPr>
       </w:pPr>
       <w:r>
@@ -1502,16 +1468,16 @@
           <wp:inline distB="114300" distT="114300" distL="114300" distR="114300">
             <wp:extent cx="3043238" cy="814492"/>
             <wp:effectExtent b="0" l="0" r="0" t="0"/>
-            <wp:docPr id="3" name="image2.png"/>
+            <wp:docPr id="4" name="image5.png"/>
             <a:graphic>
               <a:graphicData uri="http://schemas.openxmlformats.org/drawingml/2006/picture">
                 <pic:pic>
                   <pic:nvPicPr>
-                    <pic:cNvPr id="0" name="image2.png"/>
+                    <pic:cNvPr id="0" name="image5.png"/>
                     <pic:cNvPicPr preferRelativeResize="0"/>
                   </pic:nvPicPr>
                   <pic:blipFill>
-                    <a:blip r:embed="rId13"/>
+                    <a:blip r:embed="rId14"/>
                     <a:srcRect b="0" l="0" r="34135" t="42951"/>
                     <a:stretch>
                       <a:fillRect/>
@@ -1550,7 +1516,6 @@
           <w:rFonts w:ascii="Lato" w:cs="Lato" w:eastAsia="Lato" w:hAnsi="Lato"/>
           <w:sz w:val="21"/>
           <w:szCs w:val="21"/>
-          <w:u w:val="none"/>
         </w:rPr>
       </w:pPr>
       <w:r>
@@ -1562,6 +1527,11 @@
         </w:rPr>
         <w:t xml:space="preserve">Lastly, to experiment with filtering, we should try getting counting the amount of sepal lengths which are between 5 and 6</w:t>
       </w:r>
+      <w:r>
+        <w:rPr>
+          <w:rtl w:val="0"/>
+        </w:rPr>
+      </w:r>
     </w:p>
     <w:p>
       <w:pPr>
@@ -1929,7 +1899,7 @@
         </w:rPr>
         <w:t xml:space="preserve">Now, try it on your own, with the fixed acidity in the wine quality dataset: </w:t>
       </w:r>
-      <w:hyperlink r:id="rId14">
+      <w:hyperlink r:id="rId15">
         <w:r>
           <w:rPr>
             <w:rFonts w:ascii="Lato" w:cs="Lato" w:eastAsia="Lato" w:hAnsi="Lato"/>
@@ -2809,4 +2779,19 @@
   </a:objectDefaults>
   <a:extraClrSchemeLst/>
 </a:theme>
+</file>
+
+<file path=customXML/item1.xml><?xml version="1.0" encoding="utf-8"?>
+<go:gDocsCustomXmlDataStorage xmlns:go="http://customooxmlschemas.google.com/" xmlns:r="http://schemas.openxmlformats.org/officeDocument/2006/relationships" uri="GoogleDocsCustomDataVersion2">
+  <go:docsCustomData xmlns:go="http://customooxmlschemas.google.com/" roundtripDataSignature="AMtx7mgEZKDQtSdkyLReAN8c5N1x5sdX6Q==">CgMxLjA4AHIhMW5rX2sxSE9jQllrWmdqNHZEeXlIR3FYb3p4azNHNkpr</go:docsCustomData>
+</go:gDocsCustomXmlDataStorage>
+</file>
+
+<file path=customXML/itemProps1.xml><?xml version="1.0" encoding="utf-8"?>
+<ds:datastoreItem xmlns:ds="http://schemas.openxmlformats.org/officeDocument/2006/customXml" ds:itemID="{11111111-1234-1234-1234-123412341234}">
+  <ds:schemaRefs>
+    <ds:schemaRef ds:uri="http://schemas.openxmlformats.org/officeDocument/2006/relationships"/>
+    <ds:schemaRef ds:uri="http://customooxmlschemas.google.com/"/>
+  </ds:schemaRefs>
+</ds:datastoreItem>
 </file>
</xml_diff>